<commit_message>
fix(deviz-header): LLM markdown strip, cache key None sentinel
</commit_message>
<xml_diff>
--- a/output_AO/Scoala Dragomiresti/Raport_Oferta_1.docx
+++ b/output_AO/Scoala Dragomiresti/Raport_Oferta_1.docx
@@ -389,7 +389,7 @@
                 <w:b/>
                 <w:sz w:val="18"/>
               </w:rPr>
-              <w:t>Capitol de lucrări 2.0-2.1 — ARHITECTURA - LUCRARI NOI  │  LIPSA: 0  │  EXTRA: 0  │  Delta: 0 ✓</w:t>
+              <w:t>Capitol de lucrări 2.0-2.1 — ARHITECTURA - LUCRARI NOI  │  LIPSA: 0  │  EXTRA: 0  │  Delta: 0 ✓  │  Ref: PDF pag. 15-28</w:t>
             </w:r>
           </w:p>
         </w:tc>
@@ -851,7 +851,7 @@
                 <w:b/>
                 <w:sz w:val="18"/>
               </w:rPr>
-              <w:t>Capitol de lucrări 2.0-2.3 — INSTALATII SANITARE  │  LIPSA: 0  │  EXTRA: 0  │  Delta: 0 ✓</w:t>
+              <w:t>Capitol de lucrări 2.0-2.3 — INSTALATII SANITARE  │  LIPSA: 0  │  EXTRA: 0  │  Delta: 0 ✓  │  Ref: PDF pag. 37-46</w:t>
             </w:r>
           </w:p>
         </w:tc>
@@ -3903,7 +3903,7 @@
                 <w:b/>
                 <w:sz w:val="18"/>
               </w:rPr>
-              <w:t>Capitol de lucrări 2.0-2.4 — INSTALATII CURENTI TARI  │  LIPSA: 0  │  EXTRA: 0  │  Delta: 0 ✓</w:t>
+              <w:t>Capitol de lucrări 2.0-2.4 — INSTALATII CURENTI TARI  │  LIPSA: 0  │  EXTRA: 0  │  Delta: 0 ✓  │  Ref: PDF pag. 48-55</w:t>
             </w:r>
           </w:p>
         </w:tc>
@@ -5475,7 +5475,7 @@
                 <w:b/>
                 <w:sz w:val="18"/>
               </w:rPr>
-              <w:t>Capitol de lucrări 2.0-2.6 — INSTALATII TERMICE  │  LIPSA: 1  │  EXTRA: 0  │  Delta: -1</w:t>
+              <w:t>Capitol de lucrări 2.0-2.6 — INSTALATII TERMICE  │  LIPSA: 1  │  EXTRA: 0  │  Delta: -1  │  Ref: PDF pag. 60-67</w:t>
             </w:r>
           </w:p>
         </w:tc>
@@ -6404,7 +6404,7 @@
                 <w:b/>
                 <w:sz w:val="18"/>
               </w:rPr>
-              <w:t>Capitol de lucrări 3.0-3.3 — INSTALATII SANITARE  │  LIPSA: 0  │  EXTRA: 0  │  Delta: 0 ✓</w:t>
+              <w:t>Capitol de lucrări 3.0-3.3 — INSTALATII SANITARE  │  LIPSA: 0  │  EXTRA: 0  │  Delta: 0 ✓  │  Ref: PDF pag. 88-91</w:t>
             </w:r>
           </w:p>
         </w:tc>
@@ -6681,7 +6681,7 @@
                 <w:b/>
                 <w:sz w:val="18"/>
               </w:rPr>
-              <w:t>Capitol de lucrări 4.0-4.1 — INSTALATII SANITARE  │  LIPSA: 0  │  EXTRA: 0  │  Delta: 0 ✓</w:t>
+              <w:t>Capitol de lucrări 4.0-4.1 — INSTALATII SANITARE  │  LIPSA: 0  │  EXTRA: 0  │  Delta: 0 ✓  │  Ref: PDF pag. 102-104</w:t>
             </w:r>
           </w:p>
         </w:tc>
@@ -6958,7 +6958,7 @@
                 <w:b/>
                 <w:sz w:val="18"/>
               </w:rPr>
-              <w:t>Capitol de lucrări 9.0-9.1 — MONTAJ ECHIPAMENTE  │  LIPSA: 1  │  EXTRA: 0  │  Delta: -1</w:t>
+              <w:t>Capitol de lucrări 9.0-9.1 — MONTAJ ECHIPAMENTE  │  LIPSA: 1  │  EXTRA: 0  │  Delta: -1  │  Ref: PDF pag. 131-136</w:t>
             </w:r>
           </w:p>
         </w:tc>

</xml_diff>